<commit_message>
Add feature file download button and JIRA integration screenshots for Week 3 Day 2
</commit_message>
<xml_diff>
--- a/phase-1/week-3/day-2/week3-day2-user-stores-to-test-case-generator-with-feature-file-added.docx
+++ b/phase-1/week-3/day-2/week3-day2-user-stores-to-test-case-generator-with-feature-file-added.docx
@@ -22,6 +22,7 @@
       </w:r>
       <w:r>
         <w:rPr>
+          <w:noProof/>
           <w:lang w:val="en-US"/>
         </w:rPr>
         <w:drawing>
@@ -40,7 +41,7 @@
                     <pic:cNvPicPr/>
                   </pic:nvPicPr>
                   <pic:blipFill>
-                    <a:blip r:embed="rId4"/>
+                    <a:blip r:embed="rId6"/>
                     <a:stretch>
                       <a:fillRect/>
                     </a:stretch>
@@ -81,6 +82,7 @@
       </w:r>
       <w:r>
         <w:rPr>
+          <w:noProof/>
           <w:lang w:val="en-US"/>
         </w:rPr>
         <w:drawing>
@@ -99,7 +101,7 @@
                     <pic:cNvPicPr/>
                   </pic:nvPicPr>
                   <pic:blipFill>
-                    <a:blip r:embed="rId5"/>
+                    <a:blip r:embed="rId7"/>
                     <a:stretch>
                       <a:fillRect/>
                     </a:stretch>
@@ -130,24 +132,20 @@
           <w:lang w:val="en-US"/>
         </w:rPr>
         <w:br/>
-      </w:r>
-      <w:r>
-        <w:rPr>
+        <w:t>Test cases generated</w:t>
+      </w:r>
+      <w:r>
+        <w:rPr>
+          <w:lang w:val="en-US"/>
+        </w:rPr>
+        <w:br/>
+      </w:r>
+      <w:r>
+        <w:rPr>
+          <w:noProof/>
           <w:lang w:val="en-US"/>
         </w:rPr>
         <w:lastRenderedPageBreak/>
-        <w:t>Test cases generated</w:t>
-      </w:r>
-      <w:r>
-        <w:rPr>
-          <w:lang w:val="en-US"/>
-        </w:rPr>
-        <w:br/>
-      </w:r>
-      <w:r>
-        <w:rPr>
-          <w:lang w:val="en-US"/>
-        </w:rPr>
         <w:drawing>
           <wp:inline distT="0" distB="0" distL="0" distR="0" wp14:anchorId="13D6ED4D" wp14:editId="09A39ABD">
             <wp:extent cx="5731510" cy="3234055"/>
@@ -164,7 +162,7 @@
                     <pic:cNvPicPr/>
                   </pic:nvPicPr>
                   <pic:blipFill>
-                    <a:blip r:embed="rId6"/>
+                    <a:blip r:embed="rId8"/>
                     <a:stretch>
                       <a:fillRect/>
                     </a:stretch>
@@ -184,6 +182,121 @@
           </wp:inline>
         </w:drawing>
       </w:r>
+      <w:r>
+        <w:rPr>
+          <w:lang w:val="en-US"/>
+        </w:rPr>
+        <w:br/>
+      </w:r>
+      <w:r>
+        <w:rPr>
+          <w:lang w:val="en-US"/>
+        </w:rPr>
+        <w:br/>
+        <w:t>Download Feature file button added</w:t>
+      </w:r>
+      <w:r>
+        <w:rPr>
+          <w:lang w:val="en-US"/>
+        </w:rPr>
+        <w:br/>
+      </w:r>
+      <w:r>
+        <w:rPr>
+          <w:lang w:val="en-US"/>
+        </w:rPr>
+        <w:drawing>
+          <wp:inline distT="0" distB="0" distL="0" distR="0" wp14:anchorId="67B0661E" wp14:editId="2D81CD82">
+            <wp:extent cx="5731510" cy="4709160"/>
+            <wp:effectExtent l="0" t="0" r="2540" b="0"/>
+            <wp:docPr id="1622700904" name="Picture 1"/>
+            <wp:cNvGraphicFramePr>
+              <a:graphicFrameLocks xmlns:a="http://schemas.openxmlformats.org/drawingml/2006/main" noChangeAspect="1"/>
+            </wp:cNvGraphicFramePr>
+            <a:graphic xmlns:a="http://schemas.openxmlformats.org/drawingml/2006/main">
+              <a:graphicData uri="http://schemas.openxmlformats.org/drawingml/2006/picture">
+                <pic:pic xmlns:pic="http://schemas.openxmlformats.org/drawingml/2006/picture">
+                  <pic:nvPicPr>
+                    <pic:cNvPr id="1622700904" name=""/>
+                    <pic:cNvPicPr/>
+                  </pic:nvPicPr>
+                  <pic:blipFill>
+                    <a:blip r:embed="rId9"/>
+                    <a:stretch>
+                      <a:fillRect/>
+                    </a:stretch>
+                  </pic:blipFill>
+                  <pic:spPr>
+                    <a:xfrm>
+                      <a:off x="0" y="0"/>
+                      <a:ext cx="5731510" cy="4709160"/>
+                    </a:xfrm>
+                    <a:prstGeom prst="rect">
+                      <a:avLst/>
+                    </a:prstGeom>
+                  </pic:spPr>
+                </pic:pic>
+              </a:graphicData>
+            </a:graphic>
+          </wp:inline>
+        </w:drawing>
+      </w:r>
+      <w:r>
+        <w:rPr>
+          <w:lang w:val="en-US"/>
+        </w:rPr>
+        <w:br/>
+      </w:r>
+      <w:r>
+        <w:rPr>
+          <w:lang w:val="en-US"/>
+        </w:rPr>
+        <w:br/>
+        <w:t>Added downloaded Feature file below</w:t>
+      </w:r>
+      <w:r>
+        <w:rPr>
+          <w:lang w:val="en-US"/>
+        </w:rPr>
+        <w:br/>
+      </w:r>
+      <w:r>
+        <w:rPr>
+          <w:lang w:val="en-US"/>
+        </w:rPr>
+        <w:lastRenderedPageBreak/>
+        <w:br/>
+      </w:r>
+      <w:r>
+        <w:rPr>
+          <w:lang w:val="en-US"/>
+        </w:rPr>
+        <w:object w:dxaOrig="1516" w:dyaOrig="989" w14:anchorId="456AE346">
+          <v:shapetype id="_x0000_t75" coordsize="21600,21600" o:spt="75" o:preferrelative="t" path="m@4@5l@4@11@9@11@9@5xe" filled="f" stroked="f">
+            <v:stroke joinstyle="miter"/>
+            <v:formulas>
+              <v:f eqn="if lineDrawn pixelLineWidth 0"/>
+              <v:f eqn="sum @0 1 0"/>
+              <v:f eqn="sum 0 0 @1"/>
+              <v:f eqn="prod @2 1 2"/>
+              <v:f eqn="prod @3 21600 pixelWidth"/>
+              <v:f eqn="prod @3 21600 pixelHeight"/>
+              <v:f eqn="sum @0 0 1"/>
+              <v:f eqn="prod @6 1 2"/>
+              <v:f eqn="prod @7 21600 pixelWidth"/>
+              <v:f eqn="sum @8 21600 0"/>
+              <v:f eqn="prod @7 21600 pixelHeight"/>
+              <v:f eqn="sum @10 21600 0"/>
+            </v:formulas>
+            <v:path o:extrusionok="f" gradientshapeok="t" o:connecttype="rect"/>
+            <o:lock v:ext="edit" aspectratio="t"/>
+          </v:shapetype>
+          <v:shape id="_x0000_i1025" type="#_x0000_t75" style="width:75.6pt;height:49.2pt" o:ole="">
+            <v:imagedata r:id="rId10" o:title=""/>
+          </v:shape>
+          <o:OLEObject Type="Embed" ProgID="Package" ShapeID="_x0000_i1025" DrawAspect="Icon" ObjectID="_1841533177" r:id="rId11"/>
+        </w:object>
+      </w:r>
     </w:p>
     <w:sectPr>
       <w:pgSz w:w="11906" w:h="16838"/>
@@ -193,6 +306,56 @@
     </w:sectPr>
   </w:body>
 </w:document>
+</file>
+
+<file path=word/endnotes.xml><?xml version="1.0" encoding="utf-8"?>
+<w:endnotes xmlns:wpc="http://schemas.microsoft.com/office/word/2010/wordprocessingCanvas" xmlns:cx="http://schemas.microsoft.com/office/drawing/2014/chartex" xmlns:cx1="http://schemas.microsoft.com/office/drawing/2015/9/8/chartex" xmlns:cx2="http://schemas.microsoft.com/office/drawing/2015/10/21/chartex" xmlns:cx3="http://schemas.microsoft.com/office/drawing/2016/5/9/chartex" xmlns:cx4="http://schemas.microsoft.com/office/drawing/2016/5/10/chartex" xmlns:cx5="http://schemas.microsoft.com/office/drawing/2016/5/11/chartex" xmlns:cx6="http://schemas.microsoft.com/office/drawing/2016/5/12/chartex" xmlns:cx7="http://schemas.microsoft.com/office/drawing/2016/5/13/chartex" xmlns:cx8="http://schemas.microsoft.com/office/drawing/2016/5/14/chartex" xmlns:mc="http://schemas.openxmlformats.org/markup-compatibility/2006" xmlns:aink="http://schemas.microsoft.com/office/drawing/2016/ink" xmlns:am3d="http://schemas.microsoft.com/office/drawing/2017/model3d" xmlns:o="urn:schemas-microsoft-com:office:office" xmlns:oel="http://schemas.microsoft.com/office/2019/extlst" xmlns:r="http://schemas.openxmlformats.org/officeDocument/2006/relationships" xmlns:m="http://schemas.openxmlformats.org/officeDocument/2006/math" xmlns:v="urn:schemas-microsoft-com:vml" xmlns:wp14="http://schemas.microsoft.com/office/word/2010/wordprocessingDrawing" xmlns:wp="http://schemas.openxmlformats.org/drawingml/2006/wordprocessingDrawing" xmlns:w10="urn:schemas-microsoft-com:office:word" xmlns:w="http://schemas.openxmlformats.org/wordprocessingml/2006/main" xmlns:w14="http://schemas.microsoft.com/office/word/2010/wordml" xmlns:w15="http://schemas.microsoft.com/office/word/2012/wordml" xmlns:w16cex="http://schemas.microsoft.com/office/word/2018/wordml/cex" xmlns:w16cid="http://schemas.microsoft.com/office/word/2016/wordml/cid" xmlns:w16="http://schemas.microsoft.com/office/word/2018/wordml" xmlns:w16du="http://schemas.microsoft.com/office/word/2023/wordml/word16du" xmlns:w16sdtdh="http://schemas.microsoft.com/office/word/2020/wordml/sdtdatahash" xmlns:w16sdtfl="http://schemas.microsoft.com/office/word/2024/wordml/sdtformatlock" xmlns:w16se="http://schemas.microsoft.com/office/word/2015/wordml/symex" xmlns:wpg="http://schemas.microsoft.com/office/word/2010/wordprocessingGroup" xmlns:wpi="http://schemas.microsoft.com/office/word/2010/wordprocessingInk" xmlns:wne="http://schemas.microsoft.com/office/word/2006/wordml" xmlns:wps="http://schemas.microsoft.com/office/word/2010/wordprocessingShape" mc:Ignorable="w14 w15 w16se w16cid w16 w16cex w16sdtdh w16sdtfl w16du wp14">
+  <w:endnote w:type="separator" w:id="-1">
+    <w:p>
+      <w:pPr>
+        <w:spacing w:after="0" w:line="240" w:lineRule="auto"/>
+      </w:pPr>
+      <w:r>
+        <w:separator/>
+      </w:r>
+    </w:p>
+  </w:endnote>
+  <w:endnote w:type="continuationSeparator" w:id="0">
+    <w:p>
+      <w:pPr>
+        <w:spacing w:after="0" w:line="240" w:lineRule="auto"/>
+      </w:pPr>
+      <w:r>
+        <w:continuationSeparator/>
+      </w:r>
+    </w:p>
+  </w:endnote>
+</w:endnotes>
+</file>
+
+<file path=word/footnotes.xml><?xml version="1.0" encoding="utf-8"?>
+<w:footnotes xmlns:wpc="http://schemas.microsoft.com/office/word/2010/wordprocessingCanvas" xmlns:cx="http://schemas.microsoft.com/office/drawing/2014/chartex" xmlns:cx1="http://schemas.microsoft.com/office/drawing/2015/9/8/chartex" xmlns:cx2="http://schemas.microsoft.com/office/drawing/2015/10/21/chartex" xmlns:cx3="http://schemas.microsoft.com/office/drawing/2016/5/9/chartex" xmlns:cx4="http://schemas.microsoft.com/office/drawing/2016/5/10/chartex" xmlns:cx5="http://schemas.microsoft.com/office/drawing/2016/5/11/chartex" xmlns:cx6="http://schemas.microsoft.com/office/drawing/2016/5/12/chartex" xmlns:cx7="http://schemas.microsoft.com/office/drawing/2016/5/13/chartex" xmlns:cx8="http://schemas.microsoft.com/office/drawing/2016/5/14/chartex" xmlns:mc="http://schemas.openxmlformats.org/markup-compatibility/2006" xmlns:aink="http://schemas.microsoft.com/office/drawing/2016/ink" xmlns:am3d="http://schemas.microsoft.com/office/drawing/2017/model3d" xmlns:o="urn:schemas-microsoft-com:office:office" xmlns:oel="http://schemas.microsoft.com/office/2019/extlst" xmlns:r="http://schemas.openxmlformats.org/officeDocument/2006/relationships" xmlns:m="http://schemas.openxmlformats.org/officeDocument/2006/math" xmlns:v="urn:schemas-microsoft-com:vml" xmlns:wp14="http://schemas.microsoft.com/office/word/2010/wordprocessingDrawing" xmlns:wp="http://schemas.openxmlformats.org/drawingml/2006/wordprocessingDrawing" xmlns:w10="urn:schemas-microsoft-com:office:word" xmlns:w="http://schemas.openxmlformats.org/wordprocessingml/2006/main" xmlns:w14="http://schemas.microsoft.com/office/word/2010/wordml" xmlns:w15="http://schemas.microsoft.com/office/word/2012/wordml" xmlns:w16cex="http://schemas.microsoft.com/office/word/2018/wordml/cex" xmlns:w16cid="http://schemas.microsoft.com/office/word/2016/wordml/cid" xmlns:w16="http://schemas.microsoft.com/office/word/2018/wordml" xmlns:w16du="http://schemas.microsoft.com/office/word/2023/wordml/word16du" xmlns:w16sdtdh="http://schemas.microsoft.com/office/word/2020/wordml/sdtdatahash" xmlns:w16sdtfl="http://schemas.microsoft.com/office/word/2024/wordml/sdtformatlock" xmlns:w16se="http://schemas.microsoft.com/office/word/2015/wordml/symex" xmlns:wpg="http://schemas.microsoft.com/office/word/2010/wordprocessingGroup" xmlns:wpi="http://schemas.microsoft.com/office/word/2010/wordprocessingInk" xmlns:wne="http://schemas.microsoft.com/office/word/2006/wordml" xmlns:wps="http://schemas.microsoft.com/office/word/2010/wordprocessingShape" mc:Ignorable="w14 w15 w16se w16cid w16 w16cex w16sdtdh w16sdtfl w16du wp14">
+  <w:footnote w:type="separator" w:id="-1">
+    <w:p>
+      <w:pPr>
+        <w:spacing w:after="0" w:line="240" w:lineRule="auto"/>
+      </w:pPr>
+      <w:r>
+        <w:separator/>
+      </w:r>
+    </w:p>
+  </w:footnote>
+  <w:footnote w:type="continuationSeparator" w:id="0">
+    <w:p>
+      <w:pPr>
+        <w:spacing w:after="0" w:line="240" w:lineRule="auto"/>
+      </w:pPr>
+      <w:r>
+        <w:continuationSeparator/>
+      </w:r>
+    </w:p>
+  </w:footnote>
+</w:footnotes>
 </file>
 
 <file path=word/styles.xml><?xml version="1.0" encoding="utf-8"?>
@@ -1112,6 +1275,50 @@
       <w:spacing w:val="5"/>
     </w:rPr>
   </w:style>
+  <w:style w:type="paragraph" w:styleId="Header">
+    <w:name w:val="header"/>
+    <w:basedOn w:val="Normal"/>
+    <w:link w:val="HeaderChar"/>
+    <w:uiPriority w:val="99"/>
+    <w:unhideWhenUsed/>
+    <w:rsid w:val="00E42699"/>
+    <w:pPr>
+      <w:tabs>
+        <w:tab w:val="center" w:pos="4513"/>
+        <w:tab w:val="right" w:pos="9026"/>
+      </w:tabs>
+      <w:spacing w:after="0" w:line="240" w:lineRule="auto"/>
+    </w:pPr>
+  </w:style>
+  <w:style w:type="character" w:customStyle="1" w:styleId="HeaderChar">
+    <w:name w:val="Header Char"/>
+    <w:basedOn w:val="DefaultParagraphFont"/>
+    <w:link w:val="Header"/>
+    <w:uiPriority w:val="99"/>
+    <w:rsid w:val="00E42699"/>
+  </w:style>
+  <w:style w:type="paragraph" w:styleId="Footer">
+    <w:name w:val="footer"/>
+    <w:basedOn w:val="Normal"/>
+    <w:link w:val="FooterChar"/>
+    <w:uiPriority w:val="99"/>
+    <w:unhideWhenUsed/>
+    <w:rsid w:val="00E42699"/>
+    <w:pPr>
+      <w:tabs>
+        <w:tab w:val="center" w:pos="4513"/>
+        <w:tab w:val="right" w:pos="9026"/>
+      </w:tabs>
+      <w:spacing w:after="0" w:line="240" w:lineRule="auto"/>
+    </w:pPr>
+  </w:style>
+  <w:style w:type="character" w:customStyle="1" w:styleId="FooterChar">
+    <w:name w:val="Footer Char"/>
+    <w:basedOn w:val="DefaultParagraphFont"/>
+    <w:link w:val="Footer"/>
+    <w:uiPriority w:val="99"/>
+    <w:rsid w:val="00E42699"/>
+  </w:style>
 </w:styles>
 </file>
 

</xml_diff>